<commit_message>
text has been updated to reflect final changes in indicators
</commit_message>
<xml_diff>
--- a/1_PCA/PCA_UQoL_Barcelona.docx
+++ b/1_PCA/PCA_UQoL_Barcelona.docx
@@ -6470,7 +6470,7 @@
         <w:t xml:space="preserve"> </w:t>
       </w:r>
       <w:r>
-        <w:t xml:space="preserve">Seven indicators are removed at this stage (see Appendix for the full polarity classification).</w:t>
+        <w:t xml:space="preserve">Eight indicators are removed at this stage (see Appendix for the full polarity classification).</w:t>
       </w:r>
     </w:p>
     <w:p>
@@ -6986,7 +6986,7 @@
         <w:pStyle w:val="FirstParagraph"/>
       </w:pPr>
       <w:r>
-        <w:t xml:space="preserve">The Urban environment dimension includes four indicators. As with the economic and Housing and shelter dimensions, PC1 and PC2 are combined for weighting.</w:t>
+        <w:t xml:space="preserve">The Urban environment dimension includes seven indicators. As with the economic and Housing and shelter dimensions, PC1 and PC2 are combined for weighting.</w:t>
       </w:r>
     </w:p>
     <w:p>
@@ -10487,7 +10487,7 @@
         <w:pStyle w:val="FirstParagraph"/>
       </w:pPr>
       <w:r>
-        <w:t xml:space="preserve">The economic dimension subset includes nine indicators covering individual income, occupation, and tourism development.</w:t>
+        <w:t xml:space="preserve">The economic dimension subset includes eight indicators covering individual income, occupation, and tourism development.</w:t>
       </w:r>
     </w:p>
     <w:p>
@@ -13723,7 +13723,7 @@
         <w:pStyle w:val="FirstParagraph"/>
       </w:pPr>
       <w:r>
-        <w:t xml:space="preserve">Because PC1 and PC2 together explain a substantial and roughly comparable share of the variance (66.43%), indicator weights are derived from a combination of both components, each scaled by its proportion of explained variance. The resulting weights are normalised to sum to one.</w:t>
+        <w:t xml:space="preserve">Because PC1 and PC2 together explain a substantial and roughly comparable share of the variance (65,45%), indicator weights are derived from a combination of both components, each scaled by its proportion of explained variance. The resulting weights are normalised to sum to one.</w:t>
       </w:r>
     </w:p>
     <w:p>
@@ -14535,7 +14535,7 @@
         <w:pStyle w:val="FirstParagraph"/>
       </w:pPr>
       <w:r>
-        <w:t xml:space="preserve">The infrastructures subset includes ten indicators (one neutral indicator, X30_Inf_Water.consumption, was removed in section 2.2).</w:t>
+        <w:t xml:space="preserve">The infrastructures subset includes seven indicators (one neutral indicator, X30_Inf_Water.consumption, was removed in section 2.2).</w:t>
       </w:r>
     </w:p>
     <w:p>

</xml_diff>